<commit_message>
TS 7.5 Tamil kramam jatai compare
</commit_message>
<xml_diff>
--- a/TS-Kramam/TS-7.5/TS 7.5 Tamil Krama Paatam Corrections.docx
+++ b/TS-Kramam/TS-7.5/TS 7.5 Tamil Krama Paatam Corrections.docx
@@ -51,17 +51,7 @@
           <w:szCs w:val="32"/>
           <w:u w:val="single"/>
         </w:rPr>
-        <w:t xml:space="preserve">7.5 </w:t>
-      </w:r>
-      <w:r>
-        <w:rPr>
-          <w:b/>
-          <w:bCs/>
-          <w:sz w:val="32"/>
-          <w:szCs w:val="32"/>
-          <w:u w:val="single"/>
-        </w:rPr>
-        <w:t xml:space="preserve">Tamil </w:t>
+        <w:t xml:space="preserve">7.5 Tamil </w:t>
       </w:r>
       <w:r>
         <w:rPr>
@@ -150,12 +140,16 @@
               <w:spacing w:before="0" w:line="240" w:lineRule="auto"/>
               <w:jc w:val="center"/>
               <w:rPr>
+                <w:b/>
+                <w:bCs/>
                 <w:sz w:val="32"/>
                 <w:szCs w:val="32"/>
               </w:rPr>
             </w:pPr>
             <w:r>
               <w:rPr>
+                <w:b/>
+                <w:bCs/>
                 <w:sz w:val="32"/>
                 <w:szCs w:val="32"/>
               </w:rPr>
@@ -167,12 +161,16 @@
               <w:spacing w:before="0" w:line="240" w:lineRule="auto"/>
               <w:jc w:val="center"/>
               <w:rPr>
+                <w:b/>
+                <w:bCs/>
                 <w:sz w:val="32"/>
                 <w:szCs w:val="32"/>
               </w:rPr>
             </w:pPr>
             <w:r>
               <w:rPr>
+                <w:b/>
+                <w:bCs/>
                 <w:sz w:val="32"/>
                 <w:szCs w:val="32"/>
               </w:rPr>
@@ -189,12 +187,16 @@
               <w:spacing w:before="0" w:line="240" w:lineRule="auto"/>
               <w:jc w:val="center"/>
               <w:rPr>
+                <w:b/>
+                <w:bCs/>
                 <w:sz w:val="32"/>
                 <w:szCs w:val="32"/>
               </w:rPr>
             </w:pPr>
             <w:r>
               <w:rPr>
+                <w:b/>
+                <w:bCs/>
                 <w:sz w:val="32"/>
                 <w:szCs w:val="32"/>
               </w:rPr>
@@ -212,12 +214,16 @@
               <w:ind w:right="-18"/>
               <w:jc w:val="center"/>
               <w:rPr>
+                <w:b/>
+                <w:bCs/>
                 <w:sz w:val="32"/>
                 <w:szCs w:val="32"/>
               </w:rPr>
             </w:pPr>
             <w:r>
               <w:rPr>
+                <w:b/>
+                <w:bCs/>
                 <w:sz w:val="32"/>
                 <w:szCs w:val="32"/>
               </w:rPr>
@@ -1637,6 +1643,9 @@
     </w:tbl>
     <w:p>
       <w:pPr>
+        <w:pBdr>
+          <w:bottom w:val="double" w:sz="6" w:space="1" w:color="auto"/>
+        </w:pBdr>
         <w:jc w:val="center"/>
         <w:rPr>
           <w:b/>
@@ -1646,7 +1655,10 @@
           <w:u w:val="single"/>
         </w:rPr>
       </w:pPr>
-      <w:r>
+    </w:p>
+    <w:p>
+      <w:pPr>
+        <w:jc w:val="center"/>
         <w:rPr>
           <w:b/>
           <w:bCs/>
@@ -1654,8 +1666,19 @@
           <w:szCs w:val="32"/>
           <w:u w:val="single"/>
         </w:rPr>
-        <w:t>==============</w:t>
-      </w:r>
+      </w:pPr>
+    </w:p>
+    <w:p>
+      <w:pPr>
+        <w:jc w:val="center"/>
+        <w:rPr>
+          <w:b/>
+          <w:bCs/>
+          <w:sz w:val="32"/>
+          <w:szCs w:val="32"/>
+          <w:u w:val="single"/>
+        </w:rPr>
+      </w:pPr>
     </w:p>
     <w:p>
       <w:pPr>
@@ -1676,6 +1699,7 @@
           <w:szCs w:val="32"/>
           <w:u w:val="single"/>
         </w:rPr>
+        <w:lastRenderedPageBreak/>
         <w:t xml:space="preserve">TS </w:t>
       </w:r>
       <w:r>
@@ -1849,7 +1873,6 @@
                 <w:sz w:val="32"/>
                 <w:szCs w:val="32"/>
               </w:rPr>
-              <w:lastRenderedPageBreak/>
               <w:t>Reference</w:t>
             </w:r>
           </w:p>
@@ -1876,7 +1899,6 @@
                 <w:sz w:val="32"/>
                 <w:szCs w:val="32"/>
               </w:rPr>
-              <w:lastRenderedPageBreak/>
               <w:t>As Printed</w:t>
             </w:r>
           </w:p>
@@ -4889,6 +4911,7 @@
                 <w:sz w:val="28"/>
                 <w:szCs w:val="32"/>
               </w:rPr>
+              <w:lastRenderedPageBreak/>
               <w:t>T.S.7.5.3.2 – Kramam</w:t>
             </w:r>
           </w:p>
@@ -5505,7 +5528,6 @@
                 <w:sz w:val="28"/>
                 <w:szCs w:val="32"/>
               </w:rPr>
-              <w:lastRenderedPageBreak/>
               <w:t>T.S.</w:t>
             </w:r>
             <w:r>
@@ -8731,6 +8753,7 @@
                 <w:sz w:val="28"/>
                 <w:szCs w:val="32"/>
               </w:rPr>
+              <w:lastRenderedPageBreak/>
               <w:t>T.S.7.5.11.2 – Kramam</w:t>
             </w:r>
           </w:p>
@@ -9071,7 +9094,6 @@
                 <w:cs/>
                 <w:lang w:bidi="ta-IN"/>
               </w:rPr>
-              <w:lastRenderedPageBreak/>
               <w:t>ப்லோ</w:t>
             </w:r>
             <w:r>
@@ -9152,7 +9174,6 @@
                 <w:cs/>
                 <w:lang w:bidi="ta-IN"/>
               </w:rPr>
-              <w:lastRenderedPageBreak/>
               <w:t>வி</w:t>
             </w:r>
             <w:r>
@@ -9390,7 +9411,6 @@
                 <w:cs/>
                 <w:lang w:bidi="ta-IN"/>
               </w:rPr>
-              <w:lastRenderedPageBreak/>
               <w:t>ப்லோ</w:t>
             </w:r>
             <w:r>
@@ -9478,7 +9498,6 @@
                 <w:sz w:val="28"/>
                 <w:szCs w:val="32"/>
               </w:rPr>
-              <w:lastRenderedPageBreak/>
               <w:t>T.S.</w:t>
             </w:r>
             <w:r>
@@ -12694,6 +12713,7 @@
                 <w:sz w:val="28"/>
                 <w:szCs w:val="32"/>
               </w:rPr>
+              <w:lastRenderedPageBreak/>
               <w:t>T.S.7.5.15.3 – Kramam</w:t>
             </w:r>
           </w:p>
@@ -13254,7 +13274,6 @@
                 <w:sz w:val="28"/>
                 <w:szCs w:val="32"/>
               </w:rPr>
-              <w:lastRenderedPageBreak/>
               <w:t>T.S.</w:t>
             </w:r>
             <w:r>
@@ -16878,6 +16897,7 @@
                 <w:sz w:val="28"/>
                 <w:szCs w:val="32"/>
               </w:rPr>
+              <w:lastRenderedPageBreak/>
               <w:t>T.S.7.5.25.1 – Kramam</w:t>
             </w:r>
           </w:p>
@@ -17359,7 +17379,6 @@
           <w:szCs w:val="40"/>
           <w:lang w:val="en-IN" w:eastAsia="en-IN"/>
         </w:rPr>
-        <w:lastRenderedPageBreak/>
         <w:t>"</w:t>
       </w:r>
       <w:r>
@@ -17470,6 +17489,33 @@
         </w:rPr>
         <w:t>wherever applicable</w:t>
       </w:r>
+    </w:p>
+    <w:p>
+      <w:pPr>
+        <w:jc w:val="center"/>
+      </w:pPr>
+      <w:r>
+        <w:rPr>
+          <w:b/>
+          <w:bCs/>
+          <w:sz w:val="32"/>
+          <w:szCs w:val="32"/>
+          <w:u w:val="single"/>
+        </w:rPr>
+        <w:t>=============</w:t>
+      </w:r>
+    </w:p>
+    <w:p>
+      <w:pPr>
+        <w:jc w:val="center"/>
+        <w:rPr>
+          <w:b/>
+          <w:bCs/>
+          <w:sz w:val="32"/>
+          <w:szCs w:val="32"/>
+          <w:u w:val="single"/>
+        </w:rPr>
+      </w:pPr>
     </w:p>
     <w:p>
       <w:pPr>
@@ -18702,7 +18748,7 @@
   <w:style w:type="paragraph" w:default="1" w:styleId="Normal">
     <w:name w:val="Normal"/>
     <w:qFormat/>
-    <w:rsid w:val="00076C05"/>
+    <w:rsid w:val="00EF5AE7"/>
     <w:pPr>
       <w:spacing w:before="120" w:line="276" w:lineRule="auto"/>
     </w:pPr>

</xml_diff>

<commit_message>
TS 7.5 Kramam Tamil corrections
</commit_message>
<xml_diff>
--- a/TS-Kramam/TS-7.5/TS 7.5 Tamil Krama Paatam Corrections.docx
+++ b/TS-Kramam/TS-7.5/TS 7.5 Tamil Krama Paatam Corrections.docx
@@ -228,6 +228,762 @@
                 <w:szCs w:val="32"/>
               </w:rPr>
               <w:t>To be read as or corrected as</w:t>
+            </w:r>
+          </w:p>
+        </w:tc>
+      </w:tr>
+      <w:tr>
+        <w:trPr>
+          <w:trHeight w:val="1672"/>
+        </w:trPr>
+        <w:tc>
+          <w:tcPr>
+            <w:tcW w:w="3764" w:type="dxa"/>
+          </w:tcPr>
+          <w:p>
+            <w:pPr>
+              <w:widowControl w:val="0"/>
+              <w:tabs>
+                <w:tab w:val="left" w:pos="993"/>
+              </w:tabs>
+              <w:autoSpaceDE w:val="0"/>
+              <w:autoSpaceDN w:val="0"/>
+              <w:adjustRightInd w:val="0"/>
+              <w:spacing w:before="0" w:line="252" w:lineRule="auto"/>
+              <w:ind w:right="297"/>
+              <w:rPr>
+                <w:rFonts w:cs="Arial"/>
+                <w:b/>
+                <w:sz w:val="28"/>
+                <w:szCs w:val="32"/>
+              </w:rPr>
+            </w:pPr>
+            <w:r>
+              <w:rPr>
+                <w:rFonts w:cs="Arial"/>
+                <w:b/>
+                <w:sz w:val="28"/>
+                <w:szCs w:val="32"/>
+              </w:rPr>
+              <w:t>T.S.7.5.</w:t>
+            </w:r>
+            <w:r>
+              <w:rPr>
+                <w:rFonts w:cs="Arial"/>
+                <w:b/>
+                <w:sz w:val="28"/>
+                <w:szCs w:val="32"/>
+              </w:rPr>
+              <w:t>7</w:t>
+            </w:r>
+            <w:r>
+              <w:rPr>
+                <w:rFonts w:cs="Arial"/>
+                <w:b/>
+                <w:sz w:val="28"/>
+                <w:szCs w:val="32"/>
+              </w:rPr>
+              <w:t>.</w:t>
+            </w:r>
+            <w:r>
+              <w:rPr>
+                <w:rFonts w:cs="Arial"/>
+                <w:b/>
+                <w:sz w:val="28"/>
+                <w:szCs w:val="32"/>
+              </w:rPr>
+              <w:t>3</w:t>
+            </w:r>
+            <w:r>
+              <w:rPr>
+                <w:rFonts w:cs="Arial"/>
+                <w:b/>
+                <w:sz w:val="28"/>
+                <w:szCs w:val="32"/>
+              </w:rPr>
+              <w:t xml:space="preserve"> – Kramam</w:t>
+            </w:r>
+          </w:p>
+          <w:p>
+            <w:pPr>
+              <w:widowControl w:val="0"/>
+              <w:tabs>
+                <w:tab w:val="left" w:pos="993"/>
+              </w:tabs>
+              <w:autoSpaceDE w:val="0"/>
+              <w:autoSpaceDN w:val="0"/>
+              <w:adjustRightInd w:val="0"/>
+              <w:spacing w:before="0" w:line="252" w:lineRule="auto"/>
+              <w:ind w:right="297"/>
+              <w:rPr>
+                <w:rFonts w:cs="Arial"/>
+                <w:b/>
+                <w:sz w:val="28"/>
+                <w:szCs w:val="32"/>
+                <w:lang w:val="en-IN"/>
+              </w:rPr>
+            </w:pPr>
+            <w:r>
+              <w:rPr>
+                <w:rFonts w:cs="Arial"/>
+                <w:b/>
+                <w:sz w:val="28"/>
+                <w:szCs w:val="32"/>
+                <w:lang w:val="en-IN"/>
+              </w:rPr>
+              <w:t xml:space="preserve">Krama Vaakyam No.– </w:t>
+            </w:r>
+            <w:r>
+              <w:rPr>
+                <w:rFonts w:cs="Arial"/>
+                <w:b/>
+                <w:sz w:val="28"/>
+                <w:szCs w:val="32"/>
+                <w:lang w:val="en-IN"/>
+              </w:rPr>
+              <w:t>51</w:t>
+            </w:r>
+          </w:p>
+          <w:p>
+            <w:pPr>
+              <w:widowControl w:val="0"/>
+              <w:tabs>
+                <w:tab w:val="left" w:pos="993"/>
+              </w:tabs>
+              <w:autoSpaceDE w:val="0"/>
+              <w:autoSpaceDN w:val="0"/>
+              <w:adjustRightInd w:val="0"/>
+              <w:spacing w:before="0" w:line="252" w:lineRule="auto"/>
+              <w:ind w:right="297"/>
+              <w:rPr>
+                <w:rFonts w:cs="Arial"/>
+                <w:b/>
+                <w:sz w:val="28"/>
+                <w:szCs w:val="32"/>
+              </w:rPr>
+            </w:pPr>
+            <w:r>
+              <w:rPr>
+                <w:rFonts w:cs="Arial"/>
+                <w:b/>
+                <w:sz w:val="28"/>
+                <w:szCs w:val="32"/>
+                <w:lang w:val="it-IT"/>
+              </w:rPr>
+              <w:t>Panchaati No</w:t>
+            </w:r>
+            <w:r>
+              <w:rPr>
+                <w:rFonts w:cs="Arial"/>
+                <w:b/>
+                <w:szCs w:val="32"/>
+                <w:lang w:val="it-IT"/>
+              </w:rPr>
+              <w:t xml:space="preserve">. - </w:t>
+            </w:r>
+            <w:r>
+              <w:rPr>
+                <w:rFonts w:cs="Arial"/>
+                <w:b/>
+                <w:sz w:val="28"/>
+                <w:szCs w:val="28"/>
+                <w:lang w:val="it-IT"/>
+              </w:rPr>
+              <w:t>21</w:t>
+            </w:r>
+          </w:p>
+        </w:tc>
+        <w:tc>
+          <w:tcPr>
+            <w:tcW w:w="4820" w:type="dxa"/>
+          </w:tcPr>
+          <w:p>
+            <w:pPr>
+              <w:widowControl w:val="0"/>
+              <w:autoSpaceDE w:val="0"/>
+              <w:autoSpaceDN w:val="0"/>
+              <w:adjustRightInd w:val="0"/>
+              <w:spacing w:before="0" w:line="240" w:lineRule="auto"/>
+              <w:rPr>
+                <w:rFonts w:ascii="Latha" w:hAnsi="Latha" w:cs="Latha"/>
+                <w:sz w:val="28"/>
+                <w:szCs w:val="28"/>
+                <w:cs/>
+                <w:lang w:bidi="ta-IN"/>
+              </w:rPr>
+            </w:pPr>
+            <w:r>
+              <w:rPr>
+                <w:rFonts w:ascii="Latha" w:hAnsi="Latha" w:cs="Latha"/>
+                <w:sz w:val="28"/>
+                <w:szCs w:val="28"/>
+                <w:cs/>
+                <w:lang w:bidi="ta-IN"/>
+              </w:rPr>
+              <w:t>நி</w:t>
+            </w:r>
+            <w:r>
+              <w:rPr>
+                <w:rFonts w:ascii="BRH Tamil Tab Extra" w:hAnsi="BRH Tamil Tab Extra" w:cs="Latha"/>
+                <w:b/>
+                <w:sz w:val="32"/>
+                <w:szCs w:val="28"/>
+                <w:lang w:bidi="ta-IN"/>
+              </w:rPr>
+              <w:t>…</w:t>
+            </w:r>
+            <w:r>
+              <w:rPr>
+                <w:rFonts w:ascii="Latha" w:hAnsi="Latha" w:cs="Latha"/>
+                <w:sz w:val="28"/>
+                <w:szCs w:val="28"/>
+                <w:cs/>
+                <w:lang w:bidi="ta-IN"/>
+              </w:rPr>
+              <w:t>ர்வப</w:t>
+            </w:r>
+            <w:r>
+              <w:rPr>
+                <w:rFonts w:ascii="BRH Tamil Tab Extra" w:hAnsi="BRH Tamil Tab Extra" w:cs="Latha"/>
+                <w:b/>
+                <w:sz w:val="36"/>
+                <w:szCs w:val="28"/>
+                <w:lang w:bidi="ta-IN"/>
+              </w:rPr>
+              <w:t>†</w:t>
+            </w:r>
+            <w:r>
+              <w:rPr>
+                <w:rFonts w:ascii="Latha" w:hAnsi="Latha" w:cs="Latha"/>
+                <w:sz w:val="28"/>
+                <w:szCs w:val="28"/>
+                <w:cs/>
+                <w:lang w:bidi="ta-IN"/>
+              </w:rPr>
+              <w:t>ந்</w:t>
+            </w:r>
+            <w:r>
+              <w:rPr>
+                <w:rFonts w:ascii="Latha" w:hAnsi="Latha" w:cs="Latha"/>
+                <w:sz w:val="28"/>
+                <w:szCs w:val="28"/>
+                <w:highlight w:val="yellow"/>
+                <w:cs/>
+                <w:lang w:bidi="ta-IN"/>
+              </w:rPr>
+              <w:t>தி</w:t>
+            </w:r>
+            <w:r>
+              <w:rPr>
+                <w:rFonts w:ascii="Latha" w:hAnsi="Latha" w:cs="Latha"/>
+                <w:sz w:val="28"/>
+                <w:szCs w:val="28"/>
+                <w:highlight w:val="yellow"/>
+                <w:lang w:bidi="ta-IN"/>
+              </w:rPr>
+              <w:t xml:space="preserve"> </w:t>
+            </w:r>
+            <w:r>
+              <w:rPr>
+                <w:rFonts w:ascii="BRH Tamil Tab Extra" w:hAnsi="BRH Tamil Tab Extra" w:cs="Latha"/>
+                <w:b/>
+                <w:sz w:val="32"/>
+                <w:szCs w:val="28"/>
+                <w:highlight w:val="yellow"/>
+                <w:lang w:bidi="ta-IN"/>
+              </w:rPr>
+              <w:t>…</w:t>
+            </w:r>
+            <w:r>
+              <w:rPr>
+                <w:rFonts w:ascii="Latha" w:hAnsi="Latha" w:cs="Latha"/>
+                <w:b/>
+                <w:bCs/>
+                <w:position w:val="-12"/>
+                <w:sz w:val="28"/>
+                <w:szCs w:val="28"/>
+                <w:highlight w:val="yellow"/>
+                <w:cs/>
+                <w:lang w:bidi="ta-IN"/>
+              </w:rPr>
+              <w:t>3</w:t>
+            </w:r>
+            <w:r>
+              <w:rPr>
+                <w:rFonts w:ascii="Latha" w:hAnsi="Latha" w:cs="Latha"/>
+                <w:sz w:val="28"/>
+                <w:szCs w:val="28"/>
+                <w:cs/>
+                <w:lang w:bidi="ta-IN"/>
+              </w:rPr>
+              <w:t>வதா</w:t>
+            </w:r>
+            <w:r>
+              <w:rPr>
+                <w:rFonts w:ascii="BRH Tamil Tab Extra" w:hAnsi="BRH Tamil Tab Extra" w:cs="Latha"/>
+                <w:b/>
+                <w:sz w:val="36"/>
+                <w:szCs w:val="28"/>
+                <w:lang w:bidi="ta-IN"/>
+              </w:rPr>
+              <w:t>‡</w:t>
+            </w:r>
+            <w:r>
+              <w:rPr>
+                <w:rFonts w:ascii="Latha" w:hAnsi="Latha" w:cs="Latha"/>
+                <w:b/>
+                <w:bCs/>
+                <w:sz w:val="32"/>
+                <w:szCs w:val="32"/>
+                <w:cs/>
+                <w:lang w:bidi="ta-IN"/>
+              </w:rPr>
+              <w:t>:</w:t>
+            </w:r>
+            <w:r>
+              <w:rPr>
+                <w:rFonts w:ascii="Latha" w:hAnsi="Latha" w:cs="Latha"/>
+                <w:sz w:val="28"/>
+                <w:szCs w:val="28"/>
+                <w:lang w:bidi="ta-IN"/>
+              </w:rPr>
+              <w:t xml:space="preserve"> | </w:t>
+            </w:r>
+            <w:r>
+              <w:rPr>
+                <w:rFonts w:ascii="Latha" w:hAnsi="Latha" w:cs="Latha"/>
+                <w:sz w:val="28"/>
+                <w:szCs w:val="28"/>
+                <w:cs/>
+                <w:lang w:bidi="ta-IN"/>
+              </w:rPr>
+              <w:t>நி</w:t>
+            </w:r>
+            <w:r>
+              <w:rPr>
+                <w:rFonts w:ascii="BRH Tamil Tab Extra" w:hAnsi="BRH Tamil Tab Extra" w:cs="Latha"/>
+                <w:b/>
+                <w:sz w:val="32"/>
+                <w:szCs w:val="28"/>
+                <w:lang w:bidi="ta-IN"/>
+              </w:rPr>
+              <w:t>…</w:t>
+            </w:r>
+            <w:r>
+              <w:rPr>
+                <w:rFonts w:ascii="Latha" w:hAnsi="Latha" w:cs="Latha"/>
+                <w:sz w:val="28"/>
+                <w:szCs w:val="28"/>
+                <w:cs/>
+                <w:lang w:bidi="ta-IN"/>
+              </w:rPr>
+              <w:t>ர்வப</w:t>
+            </w:r>
+            <w:r>
+              <w:rPr>
+                <w:rFonts w:ascii="BRH Tamil Tab Extra" w:hAnsi="BRH Tamil Tab Extra" w:cs="Latha"/>
+                <w:b/>
+                <w:sz w:val="32"/>
+                <w:szCs w:val="28"/>
+                <w:lang w:bidi="ta-IN"/>
+              </w:rPr>
+              <w:t>…</w:t>
+            </w:r>
+            <w:r>
+              <w:rPr>
+                <w:rFonts w:ascii="Latha" w:hAnsi="Latha" w:cs="Latha"/>
+                <w:sz w:val="28"/>
+                <w:szCs w:val="28"/>
+                <w:cs/>
+                <w:lang w:bidi="ta-IN"/>
+              </w:rPr>
+              <w:t>ந்தீதி</w:t>
+            </w:r>
+            <w:r>
+              <w:rPr>
+                <w:rFonts w:ascii="BRH Tamil Tab Extra" w:hAnsi="BRH Tamil Tab Extra" w:cs="Latha"/>
+                <w:b/>
+                <w:sz w:val="36"/>
+                <w:szCs w:val="28"/>
+                <w:lang w:bidi="ta-IN"/>
+              </w:rPr>
+              <w:t>†</w:t>
+            </w:r>
+            <w:r>
+              <w:rPr>
+                <w:rFonts w:ascii="Latha" w:hAnsi="Latha" w:cs="Latha"/>
+                <w:sz w:val="28"/>
+                <w:szCs w:val="28"/>
+                <w:lang w:bidi="ta-IN"/>
+              </w:rPr>
+              <w:t xml:space="preserve"> </w:t>
+            </w:r>
+            <w:r>
+              <w:rPr>
+                <w:rFonts w:ascii="Latha" w:hAnsi="Latha" w:cs="Latha"/>
+                <w:sz w:val="28"/>
+                <w:szCs w:val="28"/>
+                <w:cs/>
+                <w:lang w:bidi="ta-IN"/>
+              </w:rPr>
+              <w:t>நி</w:t>
+            </w:r>
+            <w:r>
+              <w:rPr>
+                <w:rFonts w:ascii="Latha" w:hAnsi="Latha" w:cs="Latha"/>
+                <w:b/>
+                <w:bCs/>
+                <w:sz w:val="32"/>
+                <w:szCs w:val="32"/>
+                <w:cs/>
+                <w:lang w:bidi="ta-IN"/>
+              </w:rPr>
+              <w:t>:</w:t>
+            </w:r>
+            <w:r>
+              <w:rPr>
+                <w:rFonts w:ascii="Latha" w:hAnsi="Latha" w:cs="Latha"/>
+                <w:sz w:val="28"/>
+                <w:szCs w:val="28"/>
+                <w:lang w:bidi="ta-IN"/>
+              </w:rPr>
+              <w:t xml:space="preserve"> - </w:t>
+            </w:r>
+            <w:r>
+              <w:rPr>
+                <w:rFonts w:ascii="Latha" w:hAnsi="Latha" w:cs="Latha"/>
+                <w:sz w:val="28"/>
+                <w:szCs w:val="28"/>
+                <w:cs/>
+                <w:lang w:bidi="ta-IN"/>
+              </w:rPr>
+              <w:t>வப</w:t>
+            </w:r>
+            <w:r>
+              <w:rPr>
+                <w:rFonts w:ascii="BRH Tamil Tab Extra" w:hAnsi="BRH Tamil Tab Extra" w:cs="Latha"/>
+                <w:b/>
+                <w:sz w:val="36"/>
+                <w:szCs w:val="28"/>
+                <w:lang w:bidi="ta-IN"/>
+              </w:rPr>
+              <w:t>†</w:t>
+            </w:r>
+            <w:r>
+              <w:rPr>
+                <w:rFonts w:ascii="Latha" w:hAnsi="Latha" w:cs="Latha"/>
+                <w:sz w:val="28"/>
+                <w:szCs w:val="28"/>
+                <w:cs/>
+                <w:lang w:bidi="ta-IN"/>
+              </w:rPr>
+              <w:t>ந்தி</w:t>
+            </w:r>
+            <w:r>
+              <w:rPr>
+                <w:rFonts w:ascii="Latha" w:hAnsi="Latha" w:cs="Latha"/>
+                <w:sz w:val="28"/>
+                <w:szCs w:val="28"/>
+                <w:lang w:bidi="ta-IN"/>
+              </w:rPr>
+              <w:t xml:space="preserve"> |</w:t>
+            </w:r>
+          </w:p>
+        </w:tc>
+        <w:tc>
+          <w:tcPr>
+            <w:tcW w:w="5355" w:type="dxa"/>
+          </w:tcPr>
+          <w:p>
+            <w:pPr>
+              <w:widowControl w:val="0"/>
+              <w:autoSpaceDE w:val="0"/>
+              <w:autoSpaceDN w:val="0"/>
+              <w:adjustRightInd w:val="0"/>
+              <w:spacing w:before="0" w:line="240" w:lineRule="auto"/>
+              <w:rPr>
+                <w:rFonts w:ascii="Latha" w:hAnsi="Latha" w:cs="Latha"/>
+                <w:b/>
+                <w:bCs/>
+                <w:sz w:val="28"/>
+                <w:szCs w:val="28"/>
+                <w:cs/>
+                <w:lang w:bidi="ta-IN"/>
+              </w:rPr>
+            </w:pPr>
+            <w:r>
+              <w:rPr>
+                <w:rFonts w:ascii="Latha" w:hAnsi="Latha" w:cs="Latha"/>
+                <w:sz w:val="28"/>
+                <w:szCs w:val="28"/>
+                <w:cs/>
+                <w:lang w:bidi="ta-IN"/>
+              </w:rPr>
+              <w:t>நி</w:t>
+            </w:r>
+            <w:r>
+              <w:rPr>
+                <w:rFonts w:ascii="BRH Tamil Tab Extra" w:hAnsi="BRH Tamil Tab Extra" w:cs="Latha"/>
+                <w:b/>
+                <w:sz w:val="32"/>
+                <w:szCs w:val="28"/>
+                <w:lang w:bidi="ta-IN"/>
+              </w:rPr>
+              <w:t>…</w:t>
+            </w:r>
+            <w:r>
+              <w:rPr>
+                <w:rFonts w:ascii="Latha" w:hAnsi="Latha" w:cs="Latha"/>
+                <w:sz w:val="28"/>
+                <w:szCs w:val="28"/>
+                <w:cs/>
+                <w:lang w:bidi="ta-IN"/>
+              </w:rPr>
+              <w:t>ர்வப</w:t>
+            </w:r>
+            <w:r>
+              <w:rPr>
+                <w:rFonts w:ascii="BRH Tamil Tab Extra" w:hAnsi="BRH Tamil Tab Extra" w:cs="Latha"/>
+                <w:b/>
+                <w:sz w:val="36"/>
+                <w:szCs w:val="28"/>
+                <w:lang w:bidi="ta-IN"/>
+              </w:rPr>
+              <w:t>†</w:t>
+            </w:r>
+            <w:r>
+              <w:rPr>
+                <w:rFonts w:ascii="Latha" w:hAnsi="Latha" w:cs="Latha"/>
+                <w:sz w:val="28"/>
+                <w:szCs w:val="28"/>
+                <w:cs/>
+                <w:lang w:bidi="ta-IN"/>
+              </w:rPr>
+              <w:t>ந்தி</w:t>
+            </w:r>
+            <w:r>
+              <w:rPr>
+                <w:rFonts w:ascii="Latha" w:hAnsi="Latha" w:cs="Latha"/>
+                <w:sz w:val="28"/>
+                <w:szCs w:val="28"/>
+                <w:lang w:bidi="ta-IN"/>
+              </w:rPr>
+              <w:t xml:space="preserve"> </w:t>
+            </w:r>
+            <w:r>
+              <w:rPr>
+                <w:rFonts w:ascii="Latha" w:hAnsi="Latha" w:cs="Latha"/>
+                <w:sz w:val="28"/>
+                <w:szCs w:val="28"/>
+                <w:highlight w:val="green"/>
+                <w:cs/>
+                <w:lang w:bidi="ta-IN"/>
+              </w:rPr>
+              <w:t>தே</w:t>
+            </w:r>
+            <w:r>
+              <w:rPr>
+                <w:rFonts w:ascii="BRH Tamil Tab Extra" w:hAnsi="BRH Tamil Tab Extra" w:cs="Latha"/>
+                <w:b/>
+                <w:sz w:val="32"/>
+                <w:szCs w:val="28"/>
+                <w:highlight w:val="green"/>
+                <w:lang w:bidi="ta-IN"/>
+              </w:rPr>
+              <w:t>…</w:t>
+            </w:r>
+            <w:r>
+              <w:rPr>
+                <w:rFonts w:ascii="Latha" w:hAnsi="Latha" w:cs="Latha"/>
+                <w:b/>
+                <w:bCs/>
+                <w:position w:val="-12"/>
+                <w:sz w:val="28"/>
+                <w:szCs w:val="28"/>
+                <w:cs/>
+                <w:lang w:bidi="ta-IN"/>
+              </w:rPr>
+              <w:t>3</w:t>
+            </w:r>
+            <w:r>
+              <w:rPr>
+                <w:rFonts w:ascii="Latha" w:hAnsi="Latha" w:cs="Latha"/>
+                <w:sz w:val="28"/>
+                <w:szCs w:val="28"/>
+                <w:cs/>
+                <w:lang w:bidi="ta-IN"/>
+              </w:rPr>
+              <w:t>வதா</w:t>
+            </w:r>
+            <w:r>
+              <w:rPr>
+                <w:rFonts w:ascii="BRH Tamil Tab Extra" w:hAnsi="BRH Tamil Tab Extra" w:cs="Latha"/>
+                <w:b/>
+                <w:sz w:val="36"/>
+                <w:szCs w:val="28"/>
+                <w:lang w:bidi="ta-IN"/>
+              </w:rPr>
+              <w:t>‡</w:t>
+            </w:r>
+            <w:r>
+              <w:rPr>
+                <w:rFonts w:ascii="Latha" w:hAnsi="Latha" w:cs="Latha"/>
+                <w:b/>
+                <w:bCs/>
+                <w:sz w:val="32"/>
+                <w:szCs w:val="32"/>
+                <w:cs/>
+                <w:lang w:bidi="ta-IN"/>
+              </w:rPr>
+              <w:t>:</w:t>
+            </w:r>
+            <w:r>
+              <w:rPr>
+                <w:rFonts w:ascii="Latha" w:hAnsi="Latha" w:cs="Latha"/>
+                <w:sz w:val="28"/>
+                <w:szCs w:val="28"/>
+                <w:lang w:bidi="ta-IN"/>
+              </w:rPr>
+              <w:t xml:space="preserve"> | </w:t>
+            </w:r>
+            <w:r>
+              <w:rPr>
+                <w:rFonts w:ascii="Latha" w:hAnsi="Latha" w:cs="Latha"/>
+                <w:sz w:val="28"/>
+                <w:szCs w:val="28"/>
+                <w:cs/>
+                <w:lang w:bidi="ta-IN"/>
+              </w:rPr>
+              <w:t>நி</w:t>
+            </w:r>
+            <w:r>
+              <w:rPr>
+                <w:rFonts w:ascii="BRH Tamil Tab Extra" w:hAnsi="BRH Tamil Tab Extra" w:cs="Latha"/>
+                <w:b/>
+                <w:sz w:val="32"/>
+                <w:szCs w:val="28"/>
+                <w:lang w:bidi="ta-IN"/>
+              </w:rPr>
+              <w:t>…</w:t>
+            </w:r>
+            <w:r>
+              <w:rPr>
+                <w:rFonts w:ascii="Latha" w:hAnsi="Latha" w:cs="Latha"/>
+                <w:sz w:val="28"/>
+                <w:szCs w:val="28"/>
+                <w:cs/>
+                <w:lang w:bidi="ta-IN"/>
+              </w:rPr>
+              <w:t>ர்வப</w:t>
+            </w:r>
+            <w:r>
+              <w:rPr>
+                <w:rFonts w:ascii="BRH Tamil Tab Extra" w:hAnsi="BRH Tamil Tab Extra" w:cs="Latha"/>
+                <w:b/>
+                <w:sz w:val="32"/>
+                <w:szCs w:val="28"/>
+                <w:lang w:bidi="ta-IN"/>
+              </w:rPr>
+              <w:t>…</w:t>
+            </w:r>
+            <w:r>
+              <w:rPr>
+                <w:rFonts w:ascii="Latha" w:hAnsi="Latha" w:cs="Latha"/>
+                <w:sz w:val="28"/>
+                <w:szCs w:val="28"/>
+                <w:cs/>
+                <w:lang w:bidi="ta-IN"/>
+              </w:rPr>
+              <w:t>ந்தீதி</w:t>
+            </w:r>
+            <w:r>
+              <w:rPr>
+                <w:rFonts w:ascii="BRH Tamil Tab Extra" w:hAnsi="BRH Tamil Tab Extra" w:cs="Latha"/>
+                <w:b/>
+                <w:sz w:val="36"/>
+                <w:szCs w:val="28"/>
+                <w:lang w:bidi="ta-IN"/>
+              </w:rPr>
+              <w:t>†</w:t>
+            </w:r>
+            <w:r>
+              <w:rPr>
+                <w:rFonts w:ascii="Latha" w:hAnsi="Latha" w:cs="Latha"/>
+                <w:sz w:val="28"/>
+                <w:szCs w:val="28"/>
+                <w:lang w:bidi="ta-IN"/>
+              </w:rPr>
+              <w:t xml:space="preserve"> </w:t>
+            </w:r>
+            <w:r>
+              <w:rPr>
+                <w:rFonts w:ascii="Latha" w:hAnsi="Latha" w:cs="Latha"/>
+                <w:sz w:val="28"/>
+                <w:szCs w:val="28"/>
+                <w:cs/>
+                <w:lang w:bidi="ta-IN"/>
+              </w:rPr>
+              <w:t>நி</w:t>
+            </w:r>
+            <w:r>
+              <w:rPr>
+                <w:rFonts w:ascii="Latha" w:hAnsi="Latha" w:cs="Latha"/>
+                <w:b/>
+                <w:bCs/>
+                <w:sz w:val="32"/>
+                <w:szCs w:val="32"/>
+                <w:cs/>
+                <w:lang w:bidi="ta-IN"/>
+              </w:rPr>
+              <w:t>:</w:t>
+            </w:r>
+            <w:r>
+              <w:rPr>
+                <w:rFonts w:ascii="Latha" w:hAnsi="Latha" w:cs="Latha"/>
+                <w:sz w:val="28"/>
+                <w:szCs w:val="28"/>
+                <w:lang w:bidi="ta-IN"/>
+              </w:rPr>
+              <w:t xml:space="preserve"> - </w:t>
+            </w:r>
+            <w:r>
+              <w:rPr>
+                <w:rFonts w:ascii="Latha" w:hAnsi="Latha" w:cs="Latha"/>
+                <w:sz w:val="28"/>
+                <w:szCs w:val="28"/>
+                <w:cs/>
+                <w:lang w:bidi="ta-IN"/>
+              </w:rPr>
+              <w:t>வப</w:t>
+            </w:r>
+            <w:r>
+              <w:rPr>
+                <w:rFonts w:ascii="BRH Tamil Tab Extra" w:hAnsi="BRH Tamil Tab Extra" w:cs="Latha"/>
+                <w:b/>
+                <w:sz w:val="36"/>
+                <w:szCs w:val="28"/>
+                <w:lang w:bidi="ta-IN"/>
+              </w:rPr>
+              <w:t>†</w:t>
+            </w:r>
+            <w:r>
+              <w:rPr>
+                <w:rFonts w:ascii="Latha" w:hAnsi="Latha" w:cs="Latha"/>
+                <w:sz w:val="28"/>
+                <w:szCs w:val="28"/>
+                <w:cs/>
+                <w:lang w:bidi="ta-IN"/>
+              </w:rPr>
+              <w:t>ந்தி</w:t>
+            </w:r>
+            <w:r>
+              <w:rPr>
+                <w:rFonts w:ascii="Latha" w:hAnsi="Latha" w:cs="Latha"/>
+                <w:sz w:val="28"/>
+                <w:szCs w:val="28"/>
+                <w:lang w:bidi="ta-IN"/>
+              </w:rPr>
+              <w:t xml:space="preserve"> |</w:t>
             </w:r>
           </w:p>
         </w:tc>
@@ -1699,7 +2455,6 @@
           <w:szCs w:val="32"/>
           <w:u w:val="single"/>
         </w:rPr>
-        <w:lastRenderedPageBreak/>
         <w:t xml:space="preserve">TS </w:t>
       </w:r>
       <w:r>
@@ -4112,6 +4867,7 @@
                 <w:sz w:val="28"/>
                 <w:szCs w:val="32"/>
               </w:rPr>
+              <w:lastRenderedPageBreak/>
               <w:t>T.S.</w:t>
             </w:r>
             <w:r>
@@ -4911,7 +5667,6 @@
                 <w:sz w:val="28"/>
                 <w:szCs w:val="32"/>
               </w:rPr>
-              <w:lastRenderedPageBreak/>
               <w:t>T.S.7.5.3.2 – Kramam</w:t>
             </w:r>
           </w:p>
@@ -7697,6 +8452,7 @@
                 <w:sz w:val="28"/>
                 <w:szCs w:val="32"/>
               </w:rPr>
+              <w:lastRenderedPageBreak/>
               <w:t>T.S.7.5.9.1 – Kramam</w:t>
             </w:r>
           </w:p>
@@ -8753,7 +9509,6 @@
                 <w:sz w:val="28"/>
                 <w:szCs w:val="32"/>
               </w:rPr>
-              <w:lastRenderedPageBreak/>
               <w:t>T.S.7.5.11.2 – Kramam</w:t>
             </w:r>
           </w:p>
@@ -11313,6 +12068,7 @@
                 <w:sz w:val="28"/>
                 <w:szCs w:val="32"/>
               </w:rPr>
+              <w:lastRenderedPageBreak/>
               <w:t>T.S.</w:t>
             </w:r>
             <w:r>
@@ -12713,7 +13469,6 @@
                 <w:sz w:val="28"/>
                 <w:szCs w:val="32"/>
               </w:rPr>
-              <w:lastRenderedPageBreak/>
               <w:t>T.S.7.5.15.3 – Kramam</w:t>
             </w:r>
           </w:p>
@@ -15275,6 +16030,7 @@
                 <w:sz w:val="28"/>
                 <w:szCs w:val="32"/>
               </w:rPr>
+              <w:lastRenderedPageBreak/>
               <w:t>T.S.7.5.20.1 – Kramam</w:t>
             </w:r>
           </w:p>
@@ -16897,7 +17653,6 @@
                 <w:sz w:val="28"/>
                 <w:szCs w:val="32"/>
               </w:rPr>
-              <w:lastRenderedPageBreak/>
               <w:t>T.S.7.5.25.1 – Kramam</w:t>
             </w:r>
           </w:p>
@@ -18748,7 +19503,7 @@
   <w:style w:type="paragraph" w:default="1" w:styleId="Normal">
     <w:name w:val="Normal"/>
     <w:qFormat/>
-    <w:rsid w:val="00EF5AE7"/>
+    <w:rsid w:val="00BA4F25"/>
     <w:pPr>
       <w:spacing w:before="120" w:line="276" w:lineRule="auto"/>
     </w:pPr>

</xml_diff>